<commit_message>
Correct Analysis 2 report metadata
</commit_message>
<xml_diff>
--- a/Reports/MS_Main_2026-09-23.docx
+++ b/Reports/MS_Main_2026-09-23.docx
@@ -60,16 +60,6 @@
       <w:r>
         <w:rPr/>
         <w:t>Lindsay H. Ryan</w:t>
-      </w:r>
-    </w:p>
-    <w:p>
-      <w:pPr>
-        <w:pStyle w:val="Author"/>
-        <w:rPr/>
-      </w:pPr>
-      <w:r>
-        <w:rPr/>
-        <w:t>Deborah A. Levine</w:t>
       </w:r>
     </w:p>
     <w:p>

</xml_diff>

<commit_message>
Recalculate PMM results during report rendering
</commit_message>
<xml_diff>
--- a/Reports/MS_Main_2026-09-23.docx
+++ b/Reports/MS_Main_2026-09-23.docx
@@ -360,7 +360,7 @@
       </w:pPr>
       <w:r>
         <w:rPr/>
-        <w:t>PMM versus HRS/HCAP Algorithm: 0.437</w:t>
+        <w:t>PMM versus HRS/HCAP Algorithm: 0.429</w:t>
       </w:r>
     </w:p>
     <w:p>
@@ -1701,7 +1701,7 @@
       </w:pPr>
       <w:r>
         <w:rPr/>
-        <w:t>PMM versus HRS/HCAP Algorithm: 3-class kappa 0.509; binary kappa 0.437</w:t>
+        <w:t>PMM versus HRS/HCAP Algorithm: 3-class kappa 0.509; binary kappa 0.429</w:t>
       </w:r>
     </w:p>
     <w:p>

</xml_diff>